<commit_message>
Open the Azure demonstration to everyone, with a way in for real use
The front door at /try/ signs a visitor in as the doctor, reception, a
technologist or a patient with one click and no password, all on synthetic
patients. A demonstration clock (an offset from real time, in the database)
lets anyone start a fresh working day at any hour; the daily job resets it.
"Real use" signs out of the demonstration and opens CARE's own sign-in.

The daily job now runs the migrations, so deploy.sh ships the image before
updating the job, and the build strips Windows line endings that broke the
container's entrypoint. The README, the website and the user guide link
to the live demonstration.

Co-Authored-By: Claude Opus 5.5 <noreply@anthropic.com>
</commit_message>
<xml_diff>
--- a/docs/RAD-SMART_User_Guide.docx
+++ b/docs/RAD-SMART_User_Guide.docx
@@ -3207,7 +3207,196 @@
           <w:b w:val="0"/>
           <w:i w:val="0"/>
         </w:rPr>
-        <w:t>Before the demo (15 minutes)</w:t>
+        <w:t>The quickest way: the online demonstration</w:t>
+      </w:r>
+    </w:p>
+    <w:p>
+      <w:r>
+        <w:rPr>
+          <w:b w:val="0"/>
+          <w:i w:val="0"/>
+        </w:rPr>
+        <w:t xml:space="preserve">Open https://radsmart.braveglacier-5f9807f7.uaenorth.azurecontainerapps.io/try/ in any browser. Click </w:t>
+      </w:r>
+      <w:r>
+        <w:rPr>
+          <w:b/>
+          <w:i w:val="0"/>
+        </w:rPr>
+        <w:t>Doctor</w:t>
+      </w:r>
+      <w:r>
+        <w:rPr>
+          <w:b w:val="0"/>
+          <w:i w:val="0"/>
+        </w:rPr>
+        <w:t xml:space="preserve">, </w:t>
+      </w:r>
+      <w:r>
+        <w:rPr>
+          <w:b/>
+          <w:i w:val="0"/>
+        </w:rPr>
+        <w:t>Reception</w:t>
+      </w:r>
+      <w:r>
+        <w:rPr>
+          <w:b w:val="0"/>
+          <w:i w:val="0"/>
+        </w:rPr>
+        <w:t xml:space="preserve">, </w:t>
+      </w:r>
+      <w:r>
+        <w:rPr>
+          <w:b/>
+          <w:i w:val="0"/>
+        </w:rPr>
+        <w:t>Technologist</w:t>
+      </w:r>
+      <w:r>
+        <w:rPr>
+          <w:b w:val="0"/>
+          <w:i w:val="0"/>
+        </w:rPr>
+        <w:t xml:space="preserve"> or </w:t>
+      </w:r>
+      <w:r>
+        <w:rPr>
+          <w:b/>
+          <w:i w:val="0"/>
+        </w:rPr>
+        <w:t>Patient</w:t>
+      </w:r>
+      <w:r>
+        <w:rPr>
+          <w:b w:val="0"/>
+          <w:i w:val="0"/>
+        </w:rPr>
+        <w:t xml:space="preserve"> to go straight in, with no password. Every patient is synthetic.</w:t>
+      </w:r>
+    </w:p>
+    <w:p>
+      <w:pPr>
+        <w:tabs>
+          <w:tab w:pos="340" w:val="left"/>
+        </w:tabs>
+        <w:spacing w:after="40"/>
+        <w:ind w:left="340" w:hanging="255"/>
+      </w:pPr>
+      <w:r>
+        <w:rPr>
+          <w:color w:val="1C5CAB"/>
+        </w:rPr>
+        <w:t>•</w:t>
+        <w:tab/>
+      </w:r>
+      <w:r>
+        <w:rPr>
+          <w:b w:val="0"/>
+          <w:i w:val="0"/>
+        </w:rPr>
+        <w:t xml:space="preserve">If the department clock there is outside the working day, click </w:t>
+      </w:r>
+      <w:r>
+        <w:rPr>
+          <w:b/>
+          <w:i w:val="0"/>
+        </w:rPr>
+        <w:t>Start a fresh day at 10:30</w:t>
+      </w:r>
+      <w:r>
+        <w:rPr>
+          <w:b w:val="0"/>
+          <w:i w:val="0"/>
+        </w:rPr>
+        <w:t>. The page refreshes itself until the day is ready.</w:t>
+      </w:r>
+    </w:p>
+    <w:p>
+      <w:pPr>
+        <w:tabs>
+          <w:tab w:pos="340" w:val="left"/>
+        </w:tabs>
+        <w:spacing w:after="40"/>
+        <w:ind w:left="340" w:hanging="255"/>
+      </w:pPr>
+      <w:r>
+        <w:rPr>
+          <w:color w:val="1C5CAB"/>
+        </w:rPr>
+        <w:t>•</w:t>
+        <w:tab/>
+      </w:r>
+      <w:r>
+        <w:rPr>
+          <w:b w:val="0"/>
+          <w:i w:val="0"/>
+        </w:rPr>
+        <w:t xml:space="preserve">To show a message arriving on a phone, open an approved course, scan its </w:t>
+      </w:r>
+      <w:r>
+        <w:rPr>
+          <w:b/>
+          <w:i w:val="0"/>
+        </w:rPr>
+        <w:t>Telegram (demonstration)</w:t>
+      </w:r>
+      <w:r>
+        <w:rPr>
+          <w:b w:val="0"/>
+          <w:i w:val="0"/>
+        </w:rPr>
+        <w:t xml:space="preserve"> code with the phone and press START in the bot's chat. Then click </w:t>
+      </w:r>
+      <w:r>
+        <w:rPr>
+          <w:b/>
+          <w:i w:val="0"/>
+        </w:rPr>
+        <w:t>Send on Telegram</w:t>
+      </w:r>
+      <w:r>
+        <w:rPr>
+          <w:b w:val="0"/>
+          <w:i w:val="0"/>
+        </w:rPr>
+        <w:t xml:space="preserve"> on the Messages page. The patient gets the text, the voice note and the reply buttons. In real use the same message goes by WhatsApp.</w:t>
+      </w:r>
+    </w:p>
+    <w:p>
+      <w:pPr>
+        <w:tabs>
+          <w:tab w:pos="340" w:val="left"/>
+        </w:tabs>
+        <w:spacing w:after="40"/>
+        <w:ind w:left="340" w:hanging="255"/>
+      </w:pPr>
+      <w:r>
+        <w:rPr>
+          <w:color w:val="1C5CAB"/>
+        </w:rPr>
+        <w:t>•</w:t>
+        <w:tab/>
+      </w:r>
+      <w:r>
+        <w:rPr>
+          <w:b w:val="0"/>
+          <w:i w:val="0"/>
+        </w:rPr>
+        <w:t>Everyone who tries it shares the one demonstration. It starts again every morning at 05:30 IST.</w:t>
+      </w:r>
+    </w:p>
+    <w:p>
+      <w:pPr>
+        <w:pStyle w:val="Heading2"/>
+        <w:keepNext/>
+      </w:pPr>
+      <w:r>
+        <w:rPr>
+          <w:b w:val="0"/>
+          <w:i w:val="0"/>
+        </w:rPr>
+        <w:t>Before the demo on your own CARE (15 minutes)</w:t>
       </w:r>
     </w:p>
     <w:p>
@@ -4783,7 +4972,7 @@
           <w:b w:val="0"/>
           <w:i/>
         </w:rPr>
-        <w:t>RAD-SMART proposes; a doctor or technologist decides. It is not a medical device. The demo uses synthetic data on a local copy of CARE.</w:t>
+        <w:t>RAD-SMART proposes; a doctor or technologist decides. It is not a medical device. The demo uses synthetic data only, online or on a local copy of CARE.</w:t>
       </w:r>
     </w:p>
     <w:sectPr>

</xml_diff>